<commit_message>
Richtext fix for def.docx
</commit_message>
<xml_diff>
--- a/config/def.docx
+++ b/config/def.docx
@@ -15,7 +15,23 @@
           <w:b/>
           <w:i/>
         </w:rPr>
-        <w:t xml:space="preserve"> {{ tabno }}</w:t>
+        <w:t xml:space="preserve"> {{ </w:t>
+      </w:r>
+      <w:proofErr w:type="spellStart"/>
+      <w:r>
+        <w:rPr>
+          <w:b/>
+          <w:i/>
+        </w:rPr>
+        <w:t>tabno</w:t>
+      </w:r>
+      <w:proofErr w:type="spellEnd"/>
+      <w:r>
+        <w:rPr>
+          <w:b/>
+          <w:i/>
+        </w:rPr>
+        <w:t xml:space="preserve"> }}</w:t>
       </w:r>
       <w:r>
         <w:rPr>
@@ -35,7 +51,23 @@
           <w:b/>
           <w:bCs/>
         </w:rPr>
-        <w:t>{{ comno }}</w:t>
+        <w:t xml:space="preserve">{{ </w:t>
+      </w:r>
+      <w:proofErr w:type="spellStart"/>
+      <w:r>
+        <w:rPr>
+          <w:b/>
+          <w:bCs/>
+        </w:rPr>
+        <w:t>comno</w:t>
+      </w:r>
+      <w:proofErr w:type="spellEnd"/>
+      <w:r>
+        <w:rPr>
+          <w:b/>
+          <w:bCs/>
+        </w:rPr>
+        <w:t xml:space="preserve"> }}</w:t>
       </w:r>
       <w:r>
         <w:t>.</w:t>
@@ -122,17 +154,13 @@
           </w:tcPr>
           <w:p>
             <w:r>
-              <w:t>{{</w:t>
-            </w:r>
-            <w:r>
-              <w:t>r</w:t>
-            </w:r>
-            <w:r>
-              <w:t xml:space="preserve"> </w:t>
-            </w:r>
+              <w:t xml:space="preserve">{{ </w:t>
+            </w:r>
+            <w:proofErr w:type="spellStart"/>
             <w:r>
               <w:t>chemformula</w:t>
             </w:r>
+            <w:proofErr w:type="spellEnd"/>
             <w:r>
               <w:t xml:space="preserve"> }}</w:t>
             </w:r>
@@ -159,7 +187,15 @@
           </w:tcPr>
           <w:p>
             <w:r>
-              <w:t>{{ _chemical_formula_weight }}</w:t>
+              <w:t>{{ _</w:t>
+            </w:r>
+            <w:proofErr w:type="spellStart"/>
+            <w:r>
+              <w:t>chemical_formula_weight</w:t>
+            </w:r>
+            <w:proofErr w:type="spellEnd"/>
+            <w:r>
+              <w:t xml:space="preserve"> }}</w:t>
             </w:r>
           </w:p>
         </w:tc>
@@ -170,8 +206,13 @@
             <w:tcW w:w="4290" w:type="dxa"/>
           </w:tcPr>
           <w:p>
-            <w:r>
-              <w:t>Colour, habit</w:t>
+            <w:proofErr w:type="spellStart"/>
+            <w:r>
+              <w:t>Colour</w:t>
+            </w:r>
+            <w:proofErr w:type="spellEnd"/>
+            <w:r>
+              <w:t>, habit</w:t>
             </w:r>
           </w:p>
         </w:tc>
@@ -184,14 +225,24 @@
               <w:t xml:space="preserve">{{ </w:t>
             </w:r>
             <w:r>
-              <w:t>_exptl_crystal_colour</w:t>
-            </w:r>
+              <w:t>_</w:t>
+            </w:r>
+            <w:proofErr w:type="spellStart"/>
+            <w:r>
+              <w:t>exptl_crystal_colour</w:t>
+            </w:r>
+            <w:proofErr w:type="spellEnd"/>
             <w:r>
               <w:t xml:space="preserve"> }} {{ </w:t>
             </w:r>
             <w:r>
-              <w:t>_exptl_crystal_description</w:t>
-            </w:r>
+              <w:t>_</w:t>
+            </w:r>
+            <w:proofErr w:type="spellStart"/>
+            <w:r>
+              <w:t>exptl_crystal_description</w:t>
+            </w:r>
+            <w:proofErr w:type="spellEnd"/>
             <w:r>
               <w:t xml:space="preserve"> }}</w:t>
             </w:r>
@@ -230,9 +281,11 @@
               </w:rPr>
               <w:t>{{ _</w:t>
             </w:r>
+            <w:proofErr w:type="spellStart"/>
             <w:r>
               <w:t>exptl</w:t>
             </w:r>
+            <w:proofErr w:type="spellEnd"/>
             <w:r>
               <w:rPr>
                 <w:lang w:val="ru-RU"/>
@@ -292,9 +345,11 @@
               </w:rPr>
               <w:t>{{ _</w:t>
             </w:r>
+            <w:proofErr w:type="spellStart"/>
             <w:r>
               <w:t>exptl</w:t>
             </w:r>
+            <w:proofErr w:type="spellEnd"/>
             <w:r>
               <w:rPr>
                 <w:lang w:val="ru-RU"/>
@@ -354,9 +409,11 @@
               </w:rPr>
               <w:t>{{ _</w:t>
             </w:r>
+            <w:proofErr w:type="spellStart"/>
             <w:r>
               <w:t>exptl</w:t>
             </w:r>
+            <w:proofErr w:type="spellEnd"/>
             <w:r>
               <w:rPr>
                 <w:lang w:val="ru-RU"/>
@@ -413,7 +470,15 @@
           </w:tcPr>
           <w:p>
             <w:r>
-              <w:t>{{ _diffrn_ambient_temperature }}</w:t>
+              <w:t>{{ _</w:t>
+            </w:r>
+            <w:proofErr w:type="spellStart"/>
+            <w:r>
+              <w:t>diffrn_ambient_temperature</w:t>
+            </w:r>
+            <w:proofErr w:type="spellEnd"/>
+            <w:r>
+              <w:t xml:space="preserve"> }}</w:t>
             </w:r>
           </w:p>
         </w:tc>
@@ -441,8 +506,13 @@
               <w:t xml:space="preserve">{{ </w:t>
             </w:r>
             <w:r>
-              <w:t>_diffrn_radiation_wavelength</w:t>
-            </w:r>
+              <w:t>_</w:t>
+            </w:r>
+            <w:proofErr w:type="spellStart"/>
+            <w:r>
+              <w:t>diffrn_radiation_wavelength</w:t>
+            </w:r>
+            <w:proofErr w:type="spellEnd"/>
             <w:r>
               <w:t xml:space="preserve"> }}</w:t>
             </w:r>
@@ -469,8 +539,13 @@
               <w:t xml:space="preserve">{{ </w:t>
             </w:r>
             <w:r>
-              <w:t>_space_group_crystal_system</w:t>
-            </w:r>
+              <w:t>_</w:t>
+            </w:r>
+            <w:proofErr w:type="spellStart"/>
+            <w:r>
+              <w:t>space_group_crystal_system</w:t>
+            </w:r>
+            <w:proofErr w:type="spellEnd"/>
             <w:r>
               <w:t xml:space="preserve"> }}</w:t>
             </w:r>
@@ -497,10 +572,18 @@
               <w:t>{{</w:t>
             </w:r>
             <w:r>
+              <w:t>r</w:t>
+            </w:r>
+            <w:r>
               <w:t xml:space="preserve"> </w:t>
             </w:r>
-            <w:r>
-              <w:t>spacegroup }}</w:t>
+            <w:proofErr w:type="spellStart"/>
+            <w:r>
+              <w:t>spacegroup</w:t>
+            </w:r>
+            <w:proofErr w:type="spellEnd"/>
+            <w:r>
+              <w:t xml:space="preserve"> }}</w:t>
             </w:r>
           </w:p>
         </w:tc>
@@ -531,8 +614,13 @@
               <w:t xml:space="preserve">{{ </w:t>
             </w:r>
             <w:r>
-              <w:t>_cell_length_a</w:t>
-            </w:r>
+              <w:t>_</w:t>
+            </w:r>
+            <w:proofErr w:type="spellStart"/>
+            <w:r>
+              <w:t>cell_length_a</w:t>
+            </w:r>
+            <w:proofErr w:type="spellEnd"/>
             <w:r>
               <w:t xml:space="preserve"> }}</w:t>
             </w:r>
@@ -565,10 +653,18 @@
               <w:t xml:space="preserve">{{ </w:t>
             </w:r>
             <w:r>
-              <w:t>_cell_length_</w:t>
-            </w:r>
-            <w:r>
-              <w:t>b }}</w:t>
+              <w:t>_</w:t>
+            </w:r>
+            <w:proofErr w:type="spellStart"/>
+            <w:r>
+              <w:t>cell_length_</w:t>
+            </w:r>
+            <w:r>
+              <w:t>b</w:t>
+            </w:r>
+            <w:proofErr w:type="spellEnd"/>
+            <w:r>
+              <w:t xml:space="preserve"> }}</w:t>
             </w:r>
           </w:p>
         </w:tc>
@@ -599,8 +695,13 @@
               <w:t xml:space="preserve">{{ </w:t>
             </w:r>
             <w:r>
-              <w:t>_cell_length_c</w:t>
-            </w:r>
+              <w:t>_</w:t>
+            </w:r>
+            <w:proofErr w:type="spellStart"/>
+            <w:r>
+              <w:t>cell_length_c</w:t>
+            </w:r>
+            <w:proofErr w:type="spellEnd"/>
             <w:r>
               <w:t xml:space="preserve"> }}</w:t>
             </w:r>
@@ -630,8 +731,13 @@
               <w:t xml:space="preserve">{{ </w:t>
             </w:r>
             <w:r>
-              <w:t>_cell_angle_alpha</w:t>
-            </w:r>
+              <w:t>_</w:t>
+            </w:r>
+            <w:proofErr w:type="spellStart"/>
+            <w:r>
+              <w:t>cell_angle_alpha</w:t>
+            </w:r>
+            <w:proofErr w:type="spellEnd"/>
             <w:r>
               <w:t xml:space="preserve"> }}</w:t>
             </w:r>
@@ -661,10 +767,18 @@
               <w:t xml:space="preserve">{{ </w:t>
             </w:r>
             <w:r>
-              <w:t>_cell_angle_</w:t>
-            </w:r>
-            <w:r>
-              <w:t>beta }}</w:t>
+              <w:t>_</w:t>
+            </w:r>
+            <w:proofErr w:type="spellStart"/>
+            <w:r>
+              <w:t>cell_angle_</w:t>
+            </w:r>
+            <w:r>
+              <w:t>beta</w:t>
+            </w:r>
+            <w:proofErr w:type="spellEnd"/>
+            <w:r>
+              <w:t xml:space="preserve"> }}</w:t>
             </w:r>
           </w:p>
         </w:tc>
@@ -692,10 +806,18 @@
               <w:t xml:space="preserve">{{ </w:t>
             </w:r>
             <w:r>
-              <w:t>_cell_angle_</w:t>
-            </w:r>
-            <w:r>
-              <w:t>gamma }}</w:t>
+              <w:t>_</w:t>
+            </w:r>
+            <w:proofErr w:type="spellStart"/>
+            <w:r>
+              <w:t>cell_angle_</w:t>
+            </w:r>
+            <w:r>
+              <w:t>gamma</w:t>
+            </w:r>
+            <w:proofErr w:type="spellEnd"/>
+            <w:r>
+              <w:t xml:space="preserve"> }}</w:t>
             </w:r>
           </w:p>
         </w:tc>
@@ -732,8 +854,13 @@
               <w:t xml:space="preserve">{{ </w:t>
             </w:r>
             <w:r>
-              <w:t>_cell_volume</w:t>
-            </w:r>
+              <w:t>_</w:t>
+            </w:r>
+            <w:proofErr w:type="spellStart"/>
+            <w:r>
+              <w:t>cell_volume</w:t>
+            </w:r>
+            <w:proofErr w:type="spellEnd"/>
             <w:r>
               <w:t xml:space="preserve"> }}</w:t>
             </w:r>
@@ -763,8 +890,13 @@
               <w:t xml:space="preserve">{{ </w:t>
             </w:r>
             <w:r>
-              <w:t>_cell_formula_units_z</w:t>
-            </w:r>
+              <w:t>_</w:t>
+            </w:r>
+            <w:proofErr w:type="spellStart"/>
+            <w:r>
+              <w:t>cell_formula_units_z</w:t>
+            </w:r>
+            <w:proofErr w:type="spellEnd"/>
             <w:r>
               <w:t xml:space="preserve"> }}</w:t>
             </w:r>
@@ -800,8 +932,13 @@
               <w:t xml:space="preserve">{{ </w:t>
             </w:r>
             <w:r>
-              <w:t>_exptl_crystal_density_diffrn</w:t>
-            </w:r>
+              <w:t>_</w:t>
+            </w:r>
+            <w:proofErr w:type="spellStart"/>
+            <w:r>
+              <w:t>exptl_crystal_density_diffrn</w:t>
+            </w:r>
+            <w:proofErr w:type="spellEnd"/>
             <w:r>
               <w:t xml:space="preserve"> }}</w:t>
             </w:r>
@@ -841,8 +978,13 @@
               <w:t xml:space="preserve">{{ </w:t>
             </w:r>
             <w:r>
-              <w:t>_exptl_absorpt_coefficient_mu</w:t>
-            </w:r>
+              <w:t>_</w:t>
+            </w:r>
+            <w:proofErr w:type="spellStart"/>
+            <w:r>
+              <w:t>exptl_absorpt_coefficient_mu</w:t>
+            </w:r>
+            <w:proofErr w:type="spellEnd"/>
             <w:r>
               <w:t xml:space="preserve"> }}</w:t>
             </w:r>
@@ -909,8 +1051,13 @@
             <w:tcW w:w="4290" w:type="dxa"/>
           </w:tcPr>
           <w:p>
-            <w:r>
-              <w:t>Index ranges</w:t>
+            <w:pPr>
+              <w:rPr>
+                <w:i/>
+              </w:rPr>
+            </w:pPr>
+            <w:r>
+              <w:t>Theta range, deg.</w:t>
             </w:r>
           </w:p>
         </w:tc>
@@ -920,169 +1067,38 @@
           </w:tcPr>
           <w:p>
             <w:r>
-              <w:t xml:space="preserve">{{ </w:t>
-            </w:r>
-            <w:r>
-              <w:t>_diffrn_reflns_limit_h_m</w:t>
-            </w:r>
-            <w:r>
-              <w:t>in }}</w:t>
+              <w:t>{{ _</w:t>
+            </w:r>
+            <w:proofErr w:type="spellStart"/>
+            <w:r>
+              <w:t>diffrn_reflns_theta_min</w:t>
+            </w:r>
+            <w:proofErr w:type="spellEnd"/>
+            <w:r>
+              <w:t xml:space="preserve"> }}</w:t>
             </w:r>
             <w:r>
               <w:t> </w:t>
             </w:r>
             <w:r>
-              <w:t>≤</w:t>
+              <w:rPr>
+                <w:rFonts w:cs="Times New Roman"/>
+              </w:rPr>
+              <w:t>–</w:t>
             </w:r>
             <w:r>
               <w:t> </w:t>
             </w:r>
             <w:r>
-              <w:rPr>
-                <w:i/>
-              </w:rPr>
-              <w:t>h</w:t>
-            </w:r>
-            <w:r>
-              <w:rPr>
-                <w:i/>
-              </w:rPr>
-              <w:t> </w:t>
-            </w:r>
-            <w:r>
-              <w:t>≤</w:t>
-            </w:r>
-            <w:r>
-              <w:t> </w:t>
-            </w:r>
-            <w:r>
-              <w:t xml:space="preserve">{{ </w:t>
-            </w:r>
-            <w:r>
-              <w:t>_diffrn_reflns_limit_h_m</w:t>
-            </w:r>
-            <w:r>
-              <w:t>ax }}</w:t>
-            </w:r>
-            <w:r>
-              <w:br/>
-            </w:r>
-            <w:r>
-              <w:t xml:space="preserve">{{ </w:t>
-            </w:r>
-            <w:r>
-              <w:t>_diffrn_reflns_limit_</w:t>
-            </w:r>
-            <w:r>
-              <w:t>k</w:t>
-            </w:r>
-            <w:r>
-              <w:t>_m</w:t>
-            </w:r>
-            <w:r>
-              <w:t>in }}</w:t>
-            </w:r>
-            <w:r>
-              <w:t> </w:t>
-            </w:r>
-            <w:r>
-              <w:t>≤</w:t>
-            </w:r>
-            <w:r>
-              <w:t> </w:t>
-            </w:r>
-            <w:r>
-              <w:rPr>
-                <w:i/>
-              </w:rPr>
-              <w:t>k</w:t>
-            </w:r>
-            <w:r>
-              <w:rPr>
-                <w:i/>
-              </w:rPr>
-              <w:t> </w:t>
-            </w:r>
-            <w:r>
-              <w:t>≤</w:t>
-            </w:r>
-            <w:r>
-              <w:t> </w:t>
-            </w:r>
-            <w:r>
-              <w:t xml:space="preserve">{{ </w:t>
-            </w:r>
-            <w:r>
-              <w:t>_diffrn_reflns_limit_</w:t>
-            </w:r>
-            <w:r>
-              <w:t>k</w:t>
-            </w:r>
-            <w:r>
-              <w:t>_m</w:t>
-            </w:r>
-            <w:r>
-              <w:t>ax }}</w:t>
-            </w:r>
-            <w:r>
-              <w:br/>
-            </w:r>
-            <w:r>
-              <w:t xml:space="preserve">{{ </w:t>
-            </w:r>
-            <w:r>
-              <w:t>_diffrn_reflns_limit_</w:t>
-            </w:r>
-            <w:r>
-              <w:t>l</w:t>
-            </w:r>
-            <w:r>
-              <w:t>_m</w:t>
-            </w:r>
-            <w:r>
-              <w:t>in }}</w:t>
-            </w:r>
-            <w:r>
-              <w:t> </w:t>
-            </w:r>
-            <w:r>
-              <w:t>≤</w:t>
-            </w:r>
-            <w:r>
-              <w:t> </w:t>
-            </w:r>
-            <w:r>
-              <w:rPr>
-                <w:i/>
-              </w:rPr>
-              <w:t>l</w:t>
-            </w:r>
-            <w:r>
-              <w:rPr>
-                <w:i/>
-              </w:rPr>
-              <w:t> </w:t>
-            </w:r>
-            <w:r>
-              <w:t>≤</w:t>
-            </w:r>
-            <w:r>
-              <w:t> </w:t>
-            </w:r>
-            <w:r>
-              <w:t xml:space="preserve">{{ </w:t>
-            </w:r>
-            <w:r>
-              <w:t>_diffrn_reflns_limit_</w:t>
-            </w:r>
-            <w:r>
-              <w:t>l</w:t>
-            </w:r>
-            <w:r>
-              <w:t>_m</w:t>
-            </w:r>
-            <w:r>
-              <w:t>ax }}</w:t>
+              <w:t>{{ _</w:t>
+            </w:r>
+            <w:proofErr w:type="spellStart"/>
+            <w:r>
+              <w:t>diffrn_reflns_theta_max</w:t>
+            </w:r>
+            <w:proofErr w:type="spellEnd"/>
+            <w:r>
+              <w:t xml:space="preserve"> }}</w:t>
             </w:r>
           </w:p>
         </w:tc>
@@ -1094,7 +1110,7 @@
           </w:tcPr>
           <w:p>
             <w:r>
-              <w:t>Reflections collected</w:t>
+              <w:t>Index ranges</w:t>
             </w:r>
           </w:p>
         </w:tc>
@@ -1107,10 +1123,210 @@
               <w:t xml:space="preserve">{{ </w:t>
             </w:r>
             <w:r>
-              <w:t xml:space="preserve">_diffrn_reflns_number  </w:t>
-            </w:r>
-            <w:r>
-              <w:t>}}</w:t>
+              <w:t>_</w:t>
+            </w:r>
+            <w:proofErr w:type="spellStart"/>
+            <w:r>
+              <w:t>diffrn_reflns_limit_h_m</w:t>
+            </w:r>
+            <w:r>
+              <w:t>in</w:t>
+            </w:r>
+            <w:proofErr w:type="spellEnd"/>
+            <w:r>
+              <w:t xml:space="preserve"> }}</w:t>
+            </w:r>
+            <w:r>
+              <w:t> </w:t>
+            </w:r>
+            <w:r>
+              <w:t>≤</w:t>
+            </w:r>
+            <w:r>
+              <w:t> </w:t>
+            </w:r>
+            <w:r>
+              <w:rPr>
+                <w:i/>
+              </w:rPr>
+              <w:t>h</w:t>
+            </w:r>
+            <w:r>
+              <w:rPr>
+                <w:i/>
+              </w:rPr>
+              <w:t> </w:t>
+            </w:r>
+            <w:r>
+              <w:t>≤</w:t>
+            </w:r>
+            <w:r>
+              <w:t> </w:t>
+            </w:r>
+            <w:r>
+              <w:t xml:space="preserve">{{ </w:t>
+            </w:r>
+            <w:r>
+              <w:t>_</w:t>
+            </w:r>
+            <w:proofErr w:type="spellStart"/>
+            <w:r>
+              <w:t>diffrn_reflns_limit_h_m</w:t>
+            </w:r>
+            <w:r>
+              <w:t>ax</w:t>
+            </w:r>
+            <w:proofErr w:type="spellEnd"/>
+            <w:r>
+              <w:t xml:space="preserve"> }}</w:t>
+            </w:r>
+            <w:r>
+              <w:br/>
+              <w:t xml:space="preserve">{{ </w:t>
+            </w:r>
+            <w:r>
+              <w:t>_</w:t>
+            </w:r>
+            <w:proofErr w:type="spellStart"/>
+            <w:r>
+              <w:t>diffrn_reflns_limit_</w:t>
+            </w:r>
+            <w:r>
+              <w:t>k</w:t>
+            </w:r>
+            <w:r>
+              <w:t>_m</w:t>
+            </w:r>
+            <w:r>
+              <w:t>in</w:t>
+            </w:r>
+            <w:proofErr w:type="spellEnd"/>
+            <w:r>
+              <w:t xml:space="preserve"> }}</w:t>
+            </w:r>
+            <w:r>
+              <w:t> </w:t>
+            </w:r>
+            <w:r>
+              <w:t>≤</w:t>
+            </w:r>
+            <w:r>
+              <w:t> </w:t>
+            </w:r>
+            <w:r>
+              <w:rPr>
+                <w:i/>
+              </w:rPr>
+              <w:t>k</w:t>
+            </w:r>
+            <w:r>
+              <w:rPr>
+                <w:i/>
+              </w:rPr>
+              <w:t> </w:t>
+            </w:r>
+            <w:r>
+              <w:t>≤</w:t>
+            </w:r>
+            <w:r>
+              <w:t> </w:t>
+            </w:r>
+            <w:r>
+              <w:t xml:space="preserve">{{ </w:t>
+            </w:r>
+            <w:r>
+              <w:t>_</w:t>
+            </w:r>
+            <w:proofErr w:type="spellStart"/>
+            <w:r>
+              <w:t>diffrn_reflns_limit_</w:t>
+            </w:r>
+            <w:r>
+              <w:t>k</w:t>
+            </w:r>
+            <w:r>
+              <w:t>_m</w:t>
+            </w:r>
+            <w:r>
+              <w:t>ax</w:t>
+            </w:r>
+            <w:proofErr w:type="spellEnd"/>
+            <w:r>
+              <w:t xml:space="preserve"> }}</w:t>
+            </w:r>
+            <w:r>
+              <w:br/>
+              <w:t xml:space="preserve">{{ </w:t>
+            </w:r>
+            <w:r>
+              <w:t>_</w:t>
+            </w:r>
+            <w:proofErr w:type="spellStart"/>
+            <w:r>
+              <w:t>diffrn_reflns_limit_</w:t>
+            </w:r>
+            <w:r>
+              <w:t>l</w:t>
+            </w:r>
+            <w:r>
+              <w:t>_m</w:t>
+            </w:r>
+            <w:r>
+              <w:t>in</w:t>
+            </w:r>
+            <w:proofErr w:type="spellEnd"/>
+            <w:r>
+              <w:t xml:space="preserve"> }}</w:t>
+            </w:r>
+            <w:r>
+              <w:t> </w:t>
+            </w:r>
+            <w:r>
+              <w:t>≤</w:t>
+            </w:r>
+            <w:r>
+              <w:t> </w:t>
+            </w:r>
+            <w:r>
+              <w:rPr>
+                <w:i/>
+              </w:rPr>
+              <w:t>l</w:t>
+            </w:r>
+            <w:r>
+              <w:rPr>
+                <w:i/>
+              </w:rPr>
+              <w:t> </w:t>
+            </w:r>
+            <w:r>
+              <w:t>≤</w:t>
+            </w:r>
+            <w:r>
+              <w:t> </w:t>
+            </w:r>
+            <w:r>
+              <w:t xml:space="preserve">{{ </w:t>
+            </w:r>
+            <w:r>
+              <w:t>_</w:t>
+            </w:r>
+            <w:proofErr w:type="spellStart"/>
+            <w:r>
+              <w:t>diffrn_reflns_limit_</w:t>
+            </w:r>
+            <w:r>
+              <w:t>l</w:t>
+            </w:r>
+            <w:r>
+              <w:t>_m</w:t>
+            </w:r>
+            <w:r>
+              <w:t>ax</w:t>
+            </w:r>
+            <w:proofErr w:type="spellEnd"/>
+            <w:r>
+              <w:t xml:space="preserve"> }}</w:t>
             </w:r>
           </w:p>
         </w:tc>
@@ -1122,7 +1338,7 @@
           </w:tcPr>
           <w:p>
             <w:r>
-              <w:t>Independent reflections</w:t>
+              <w:t>Reflections collected</w:t>
             </w:r>
           </w:p>
         </w:tc>
@@ -1132,40 +1348,21 @@
           </w:tcPr>
           <w:p>
             <w:r>
-              <w:t>{{ _</w:t>
-            </w:r>
-            <w:r>
-              <w:t>reflns_number_total</w:t>
-            </w:r>
-            <w:r>
-              <w:t xml:space="preserve"> }} (</w:t>
-            </w:r>
-            <w:r>
-              <w:rPr>
-                <w:i/>
-              </w:rPr>
-              <w:t>R</w:t>
-            </w:r>
-            <w:r>
-              <w:rPr>
-                <w:vertAlign w:val="subscript"/>
-              </w:rPr>
-              <w:t>int</w:t>
-            </w:r>
-            <w:r>
-              <w:t xml:space="preserve"> = {{ </w:t>
-            </w:r>
-            <w:r>
-              <w:t>_diffrn_reflns_av_</w:t>
-            </w:r>
-            <w:r>
-              <w:t>r</w:t>
-            </w:r>
-            <w:r>
-              <w:t>_equivalents</w:t>
-            </w:r>
-            <w:r>
-              <w:t xml:space="preserve"> }})</w:t>
+              <w:t xml:space="preserve">{{ </w:t>
+            </w:r>
+            <w:r>
+              <w:t>_</w:t>
+            </w:r>
+            <w:proofErr w:type="spellStart"/>
+            <w:r>
+              <w:t>diffrn_reflns_number</w:t>
+            </w:r>
+            <w:proofErr w:type="spellEnd"/>
+            <w:r>
+              <w:t xml:space="preserve">  </w:t>
+            </w:r>
+            <w:r>
+              <w:t>}}</w:t>
             </w:r>
           </w:p>
         </w:tc>
@@ -1177,7 +1374,7 @@
           </w:tcPr>
           <w:p>
             <w:r>
-              <w:t>Extinction coefficient</w:t>
+              <w:t>Independent reflections</w:t>
             </w:r>
           </w:p>
         </w:tc>
@@ -1187,7 +1384,79 @@
           </w:tcPr>
           <w:p>
             <w:r>
-              <w:t>{{ _refine_ls_extinction_coef }}</w:t>
+              <w:t>{{ _</w:t>
+            </w:r>
+            <w:proofErr w:type="spellStart"/>
+            <w:r>
+              <w:t>reflns_number_total</w:t>
+            </w:r>
+            <w:proofErr w:type="spellEnd"/>
+            <w:r>
+              <w:t xml:space="preserve"> }} (</w:t>
+            </w:r>
+            <w:proofErr w:type="spellStart"/>
+            <w:r>
+              <w:rPr>
+                <w:i/>
+              </w:rPr>
+              <w:t>R</w:t>
+            </w:r>
+            <w:r>
+              <w:rPr>
+                <w:vertAlign w:val="subscript"/>
+              </w:rPr>
+              <w:t>int</w:t>
+            </w:r>
+            <w:proofErr w:type="spellEnd"/>
+            <w:r>
+              <w:t xml:space="preserve"> = {{ </w:t>
+            </w:r>
+            <w:r>
+              <w:t>_</w:t>
+            </w:r>
+            <w:proofErr w:type="spellStart"/>
+            <w:r>
+              <w:t>diffrn_reflns_av_</w:t>
+            </w:r>
+            <w:r>
+              <w:t>r</w:t>
+            </w:r>
+            <w:r>
+              <w:t>_equivalents</w:t>
+            </w:r>
+            <w:proofErr w:type="spellEnd"/>
+            <w:r>
+              <w:t xml:space="preserve"> }})</w:t>
+            </w:r>
+          </w:p>
+        </w:tc>
+      </w:tr>
+      <w:tr>
+        <w:tc>
+          <w:tcPr>
+            <w:tcW w:w="4290" w:type="dxa"/>
+          </w:tcPr>
+          <w:p>
+            <w:r>
+              <w:t>Extinction coefficient</w:t>
+            </w:r>
+          </w:p>
+        </w:tc>
+        <w:tc>
+          <w:tcPr>
+            <w:tcW w:w="4340" w:type="dxa"/>
+          </w:tcPr>
+          <w:p>
+            <w:r>
+              <w:t>{{ _</w:t>
+            </w:r>
+            <w:proofErr w:type="spellStart"/>
+            <w:r>
+              <w:t>refine_ls_extinction_coef</w:t>
+            </w:r>
+            <w:proofErr w:type="spellEnd"/>
+            <w:r>
+              <w:t xml:space="preserve"> }}</w:t>
             </w:r>
           </w:p>
         </w:tc>
@@ -1204,6 +1473,7 @@
                 <w:vertAlign w:val="subscript"/>
               </w:rPr>
             </w:pPr>
+            <w:proofErr w:type="spellStart"/>
             <w:r>
               <w:rPr>
                 <w:i/>
@@ -1217,11 +1487,19 @@
               </w:rPr>
               <w:t>min</w:t>
             </w:r>
+            <w:proofErr w:type="spellEnd"/>
             <w:r>
               <w:rPr>
                 <w:i/>
               </w:rPr>
-              <w:t xml:space="preserve"> / T</w:t>
+              <w:t xml:space="preserve"> / </w:t>
+            </w:r>
+            <w:proofErr w:type="spellStart"/>
+            <w:r>
+              <w:rPr>
+                <w:i/>
+              </w:rPr>
+              <w:t>T</w:t>
             </w:r>
             <w:r>
               <w:rPr>
@@ -1230,6 +1508,7 @@
               </w:rPr>
               <w:t>max</w:t>
             </w:r>
+            <w:proofErr w:type="spellEnd"/>
           </w:p>
         </w:tc>
         <w:tc>
@@ -1288,19 +1567,7 @@
               <w:rPr>
                 <w:lang w:val="fr-FR"/>
               </w:rPr>
-              <w:t>m</w:t>
-            </w:r>
-            <w:r>
-              <w:rPr>
-                <w:lang w:val="fr-FR"/>
-              </w:rPr>
-              <w:t>ax</w:t>
-            </w:r>
-            <w:r>
-              <w:rPr>
-                <w:lang w:val="fr-FR"/>
-              </w:rPr>
-              <w:t xml:space="preserve"> }}</w:t>
+              <w:t>max }}</w:t>
             </w:r>
           </w:p>
         </w:tc>
@@ -1312,10 +1579,7 @@
           </w:tcPr>
           <w:p>
             <w:r>
-              <w:t>Data</w:t>
-            </w:r>
-            <w:r>
-              <w:t xml:space="preserve"> / restraints / parameters</w:t>
+              <w:t>Data / restraints / parameters</w:t>
             </w:r>
           </w:p>
         </w:tc>
@@ -1328,8 +1592,13 @@
               <w:t xml:space="preserve">{{ </w:t>
             </w:r>
             <w:r>
-              <w:t>_refine_ls_number_reflns</w:t>
-            </w:r>
+              <w:t>_</w:t>
+            </w:r>
+            <w:proofErr w:type="spellStart"/>
+            <w:r>
+              <w:t>refine_ls_number_reflns</w:t>
+            </w:r>
+            <w:proofErr w:type="spellEnd"/>
             <w:r>
               <w:t xml:space="preserve"> }}</w:t>
             </w:r>
@@ -1346,8 +1615,13 @@
               <w:t xml:space="preserve">{{ </w:t>
             </w:r>
             <w:r>
-              <w:t>_refine_ls_number_restraints</w:t>
-            </w:r>
+              <w:t>_</w:t>
+            </w:r>
+            <w:proofErr w:type="spellStart"/>
+            <w:r>
+              <w:t>refine_ls_number_restraints</w:t>
+            </w:r>
+            <w:proofErr w:type="spellEnd"/>
             <w:r>
               <w:t xml:space="preserve"> }}</w:t>
             </w:r>
@@ -1364,8 +1638,13 @@
               <w:t xml:space="preserve">{{ </w:t>
             </w:r>
             <w:r>
-              <w:t>_refine_ls_number_parameters</w:t>
-            </w:r>
+              <w:t>_</w:t>
+            </w:r>
+            <w:proofErr w:type="spellStart"/>
+            <w:r>
+              <w:t>refine_ls_number_parameters</w:t>
+            </w:r>
+            <w:proofErr w:type="spellEnd"/>
             <w:r>
               <w:t xml:space="preserve"> }}</w:t>
             </w:r>
@@ -1392,8 +1671,13 @@
               <w:t xml:space="preserve">{{ </w:t>
             </w:r>
             <w:r>
-              <w:t>_refine_ls_goodness_of_fit_ref</w:t>
-            </w:r>
+              <w:t>_</w:t>
+            </w:r>
+            <w:proofErr w:type="spellStart"/>
+            <w:r>
+              <w:t>refine_ls_goodness_of_fit_ref</w:t>
+            </w:r>
+            <w:proofErr w:type="spellEnd"/>
             <w:r>
               <w:t xml:space="preserve"> }}</w:t>
             </w:r>
@@ -1416,25 +1700,13 @@
               <w:rPr>
                 <w:vertAlign w:val="subscript"/>
               </w:rPr>
-              <w:t>1</w:t>
-            </w:r>
-            <w:r>
-              <w:rPr>
-                <w:vertAlign w:val="subscript"/>
-              </w:rPr>
-              <w:t xml:space="preserve"> </w:t>
+              <w:t xml:space="preserve">1 </w:t>
             </w:r>
             <w:r>
               <w:rPr>
                 <w:i/>
               </w:rPr>
-              <w:t xml:space="preserve">/ </w:t>
-            </w:r>
-            <w:r>
-              <w:rPr>
-                <w:i/>
-              </w:rPr>
-              <w:t>wR</w:t>
+              <w:t>/ wR</w:t>
             </w:r>
             <w:r>
               <w:rPr>
@@ -1483,14 +1755,16 @@
               <w:t xml:space="preserve">1 </w:t>
             </w:r>
             <w:r>
-              <w:t xml:space="preserve">= </w:t>
-            </w:r>
-            <w:r>
-              <w:t xml:space="preserve">{{ </w:t>
-            </w:r>
-            <w:r>
-              <w:t>_refine_ls_R_factor_gt</w:t>
-            </w:r>
+              <w:t xml:space="preserve">= {{ </w:t>
+            </w:r>
+            <w:r>
+              <w:t>_</w:t>
+            </w:r>
+            <w:proofErr w:type="spellStart"/>
+            <w:r>
+              <w:t>refine_ls_R_factor_gt</w:t>
+            </w:r>
+            <w:proofErr w:type="spellEnd"/>
             <w:r>
               <w:t xml:space="preserve"> </w:t>
             </w:r>
@@ -1498,7 +1772,11 @@
               <w:t xml:space="preserve">or </w:t>
             </w:r>
             <w:r>
-              <w:t>_refine_ls_</w:t>
+              <w:t>_</w:t>
+            </w:r>
+            <w:proofErr w:type="spellStart"/>
+            <w:r>
+              <w:t>refine_ls_</w:t>
             </w:r>
             <w:r>
               <w:t>r</w:t>
@@ -1506,6 +1784,7 @@
             <w:r>
               <w:t>_factor_gt</w:t>
             </w:r>
+            <w:proofErr w:type="spellEnd"/>
             <w:r>
               <w:t xml:space="preserve"> }}</w:t>
             </w:r>
@@ -1524,19 +1803,25 @@
               <w:t>2</w:t>
             </w:r>
             <w:r>
-              <w:t xml:space="preserve"> = </w:t>
-            </w:r>
-            <w:r>
-              <w:t xml:space="preserve">{{ </w:t>
-            </w:r>
-            <w:r>
-              <w:t>_refine_ls_wR_factor_gt</w:t>
-            </w:r>
+              <w:t xml:space="preserve"> = {{ </w:t>
+            </w:r>
+            <w:r>
+              <w:t>_</w:t>
+            </w:r>
+            <w:proofErr w:type="spellStart"/>
+            <w:r>
+              <w:t>refine_ls_wR_factor_gt</w:t>
+            </w:r>
+            <w:proofErr w:type="spellEnd"/>
             <w:r>
               <w:t xml:space="preserve"> or </w:t>
             </w:r>
             <w:r>
-              <w:t>_refine_ls_</w:t>
+              <w:t>_</w:t>
+            </w:r>
+            <w:proofErr w:type="spellStart"/>
+            <w:r>
+              <w:t>refine_ls_</w:t>
             </w:r>
             <w:r>
               <w:t>wr</w:t>
@@ -1544,6 +1829,7 @@
             <w:r>
               <w:t>_factor_gt</w:t>
             </w:r>
+            <w:proofErr w:type="spellEnd"/>
             <w:r>
               <w:t xml:space="preserve"> }}</w:t>
             </w:r>
@@ -1560,31 +1846,20 @@
               <w:rPr>
                 <w:i/>
               </w:rPr>
+              <w:lastRenderedPageBreak/>
               <w:t>R</w:t>
             </w:r>
             <w:r>
               <w:rPr>
                 <w:vertAlign w:val="subscript"/>
               </w:rPr>
-              <w:t>1</w:t>
-            </w:r>
-            <w:r>
-              <w:rPr>
-                <w:vertAlign w:val="subscript"/>
-              </w:rPr>
-              <w:t xml:space="preserve"> </w:t>
+              <w:t xml:space="preserve">1 </w:t>
             </w:r>
             <w:r>
               <w:rPr>
                 <w:i/>
               </w:rPr>
-              <w:t xml:space="preserve">/ </w:t>
-            </w:r>
-            <w:r>
-              <w:rPr>
-                <w:i/>
-              </w:rPr>
-              <w:t>wR</w:t>
+              <w:t>/ wR</w:t>
             </w:r>
             <w:r>
               <w:rPr>
@@ -1593,13 +1868,7 @@
               <w:t>2</w:t>
             </w:r>
             <w:r>
-              <w:t xml:space="preserve"> (all </w:t>
-            </w:r>
-            <w:r>
-              <w:t>data</w:t>
-            </w:r>
-            <w:r>
-              <w:t>)</w:t>
+              <w:t xml:space="preserve"> (all data)</w:t>
             </w:r>
           </w:p>
         </w:tc>
@@ -1621,19 +1890,25 @@
               <w:t xml:space="preserve">1 </w:t>
             </w:r>
             <w:r>
-              <w:t xml:space="preserve">= </w:t>
-            </w:r>
-            <w:r>
-              <w:t xml:space="preserve">{{ </w:t>
-            </w:r>
-            <w:r>
-              <w:t>_refine_ls_R_factor_all</w:t>
-            </w:r>
+              <w:t xml:space="preserve">= {{ </w:t>
+            </w:r>
+            <w:r>
+              <w:t>_</w:t>
+            </w:r>
+            <w:proofErr w:type="spellStart"/>
+            <w:r>
+              <w:t>refine_ls_R_factor_all</w:t>
+            </w:r>
+            <w:proofErr w:type="spellEnd"/>
             <w:r>
               <w:t xml:space="preserve"> or </w:t>
             </w:r>
             <w:r>
-              <w:t>_refine_ls_</w:t>
+              <w:t>_</w:t>
+            </w:r>
+            <w:proofErr w:type="spellStart"/>
+            <w:r>
+              <w:t>refine_ls_</w:t>
             </w:r>
             <w:r>
               <w:t>r</w:t>
@@ -1644,6 +1919,7 @@
             <w:r>
               <w:t>all</w:t>
             </w:r>
+            <w:proofErr w:type="spellEnd"/>
             <w:r>
               <w:t xml:space="preserve"> }}</w:t>
             </w:r>
@@ -1653,7 +1929,6 @@
               <w:rPr>
                 <w:i/>
               </w:rPr>
-              <w:lastRenderedPageBreak/>
               <w:t>wR</w:t>
             </w:r>
             <w:r>
@@ -1663,19 +1938,25 @@
               <w:t>2</w:t>
             </w:r>
             <w:r>
-              <w:t xml:space="preserve"> = </w:t>
-            </w:r>
-            <w:r>
-              <w:t xml:space="preserve">{{ </w:t>
-            </w:r>
-            <w:r>
-              <w:t>_refine_ls_wR_factor_ref</w:t>
-            </w:r>
+              <w:t xml:space="preserve"> = {{ </w:t>
+            </w:r>
+            <w:r>
+              <w:t>_</w:t>
+            </w:r>
+            <w:proofErr w:type="spellStart"/>
+            <w:r>
+              <w:t>refine_ls_wR_factor_ref</w:t>
+            </w:r>
+            <w:proofErr w:type="spellEnd"/>
             <w:r>
               <w:t xml:space="preserve"> or </w:t>
             </w:r>
             <w:r>
-              <w:t>_refine_ls_</w:t>
+              <w:t>_</w:t>
+            </w:r>
+            <w:proofErr w:type="spellStart"/>
+            <w:r>
+              <w:t>refine_ls_</w:t>
             </w:r>
             <w:r>
               <w:t>wr</w:t>
@@ -1686,6 +1967,7 @@
             <w:r>
               <w:t>ref</w:t>
             </w:r>
+            <w:proofErr w:type="spellEnd"/>
             <w:r>
               <w:t xml:space="preserve"> }}</w:t>
             </w:r>
@@ -1698,12 +1980,12 @@
             <w:tcW w:w="4290" w:type="dxa"/>
           </w:tcPr>
           <w:p>
+            <w:proofErr w:type="spellStart"/>
             <w:r>
               <w:rPr>
                 <w:rFonts w:eastAsia="Times New Roman"/>
                 <w:lang w:eastAsia="ru-RU"/>
               </w:rPr>
-              <w:lastRenderedPageBreak/>
               <w:t>Δρ</w:t>
             </w:r>
             <w:r>
@@ -1714,6 +1996,7 @@
               </w:rPr>
               <w:t>max</w:t>
             </w:r>
+            <w:proofErr w:type="spellEnd"/>
             <w:r>
               <w:rPr>
                 <w:rFonts w:ascii="Symbol" w:hAnsi="Symbol" w:cs="Symbol"/>
@@ -1733,6 +2016,7 @@
               </w:rPr>
               <w:t xml:space="preserve"> </w:t>
             </w:r>
+            <w:proofErr w:type="spellStart"/>
             <w:r>
               <w:rPr>
                 <w:rFonts w:eastAsia="Times New Roman"/>
@@ -1748,12 +2032,21 @@
               </w:rPr>
               <w:t>min</w:t>
             </w:r>
+            <w:proofErr w:type="spellEnd"/>
             <w:r>
               <w:rPr>
                 <w:rFonts w:eastAsia="Times New Roman"/>
                 <w:lang w:eastAsia="ru-RU"/>
               </w:rPr>
-              <w:t>, e</w:t>
+              <w:t xml:space="preserve">, </w:t>
+            </w:r>
+            <w:proofErr w:type="spellStart"/>
+            <w:r>
+              <w:rPr>
+                <w:rFonts w:eastAsia="Times New Roman"/>
+                <w:lang w:eastAsia="ru-RU"/>
+              </w:rPr>
+              <w:t>e</w:t>
             </w:r>
             <w:r>
               <w:rPr>
@@ -1771,6 +2064,7 @@
               </w:rPr>
               <w:t>Å</w:t>
             </w:r>
+            <w:proofErr w:type="spellEnd"/>
             <w:r>
               <w:rPr>
                 <w:rFonts w:eastAsia="Times New Roman"/>
@@ -1790,601 +2084,29 @@
               <w:t xml:space="preserve">{{ </w:t>
             </w:r>
             <w:r>
-              <w:t>_refine_diff_density_max</w:t>
-            </w:r>
+              <w:t>_</w:t>
+            </w:r>
+            <w:proofErr w:type="spellStart"/>
+            <w:r>
+              <w:t>refine_diff_density_max</w:t>
+            </w:r>
+            <w:proofErr w:type="spellEnd"/>
+            <w:r>
+              <w:t xml:space="preserve"> }} / {{ </w:t>
+            </w:r>
+            <w:r>
+              <w:t>_</w:t>
+            </w:r>
+            <w:proofErr w:type="spellStart"/>
+            <w:r>
+              <w:t>refine_diff_density_m</w:t>
+            </w:r>
+            <w:r>
+              <w:t>in</w:t>
+            </w:r>
+            <w:proofErr w:type="spellEnd"/>
             <w:r>
               <w:t xml:space="preserve"> }}</w:t>
-            </w:r>
-            <w:r>
-              <w:t xml:space="preserve"> / </w:t>
-            </w:r>
-            <w:r>
-              <w:t xml:space="preserve">{{ </w:t>
-            </w:r>
-            <w:r>
-              <w:t>_refine_diff_density_m</w:t>
-            </w:r>
-            <w:r>
-              <w:t>in }}</w:t>
-            </w:r>
-          </w:p>
-        </w:tc>
-      </w:tr>
-      <w:tr>
-        <w:tc>
-          <w:tcPr>
-            <w:tcW w:w="4290" w:type="dxa"/>
-          </w:tcPr>
-          <w:p>
-            <w:r>
-              <w:t>Theta range, deg.</w:t>
-            </w:r>
-          </w:p>
-        </w:tc>
-        <w:tc>
-          <w:tcPr>
-            <w:tcW w:w="4340" w:type="dxa"/>
-          </w:tcPr>
-          <w:p>
-            <w:r>
-              <w:t>{{ _diffrn_reflns_theta_min }}</w:t>
-            </w:r>
-            <w:r>
-              <w:t> </w:t>
-            </w:r>
-            <w:r>
-              <w:rPr>
-                <w:rFonts w:cs="Times New Roman"/>
-              </w:rPr>
-              <w:t>–</w:t>
-            </w:r>
-            <w:r>
-              <w:t> </w:t>
-            </w:r>
-            <w:r>
-              <w:t>{{ _diffrn_reflns_theta_max</w:t>
-            </w:r>
-            <w:r>
-              <w:t xml:space="preserve"> }}</w:t>
-            </w:r>
-          </w:p>
-        </w:tc>
-      </w:tr>
-    </w:tbl>
-    <w:p/>
-    <w:p>
-      <w:r>
-        <w:rPr>
-          <w:b/>
-          <w:i/>
-        </w:rPr>
-        <w:t>Table {{</w:t>
-      </w:r>
-      <w:r>
-        <w:rPr>
-          <w:b/>
-          <w:i/>
-        </w:rPr>
-        <w:t xml:space="preserve"> tabno + 1</w:t>
-      </w:r>
-      <w:r>
-        <w:rPr>
-          <w:b/>
-          <w:i/>
-        </w:rPr>
-        <w:t xml:space="preserve"> }}. </w:t>
-      </w:r>
-      <w:r>
-        <w:rPr>
-          <w:i/>
-        </w:rPr>
-        <w:t xml:space="preserve">Main hydrogen bond parameters for </w:t>
-      </w:r>
-      <w:r>
-        <w:rPr>
-          <w:b/>
-          <w:bCs/>
-        </w:rPr>
-        <w:t>{{ comno }}</w:t>
-      </w:r>
-      <w:r>
-        <w:t>.</w:t>
-      </w:r>
-    </w:p>
-    <w:tbl>
-      <w:tblPr>
-        <w:tblStyle w:val="aff0"/>
-        <w:tblW w:w="10433" w:type="dxa"/>
-        <w:tblInd w:w="-5" w:type="dxa"/>
-        <w:tblLayout w:type="fixed"/>
-        <w:tblLook w:val="04A0" w:firstRow="1" w:lastRow="0" w:firstColumn="1" w:lastColumn="0" w:noHBand="0" w:noVBand="1"/>
-      </w:tblPr>
-      <w:tblGrid>
-        <w:gridCol w:w="1928"/>
-        <w:gridCol w:w="1701"/>
-        <w:gridCol w:w="1701"/>
-        <w:gridCol w:w="1701"/>
-        <w:gridCol w:w="1701"/>
-        <w:gridCol w:w="1701"/>
-      </w:tblGrid>
-      <w:tr>
-        <w:tc>
-          <w:tcPr>
-            <w:tcW w:w="1928" w:type="dxa"/>
-          </w:tcPr>
-          <w:p>
-            <w:pPr>
-              <w:rPr>
-                <w:rFonts w:cs="Times New Roman"/>
-              </w:rPr>
-            </w:pPr>
-            <w:r>
-              <w:rPr>
-                <w:rFonts w:cs="Times New Roman"/>
-              </w:rPr>
-              <w:t>D−H···A</w:t>
-            </w:r>
-          </w:p>
-        </w:tc>
-        <w:tc>
-          <w:tcPr>
-            <w:tcW w:w="1701" w:type="dxa"/>
-          </w:tcPr>
-          <w:p>
-            <w:pPr>
-              <w:rPr>
-                <w:rFonts w:cs="Times New Roman"/>
-              </w:rPr>
-            </w:pPr>
-            <w:r>
-              <w:rPr>
-                <w:rFonts w:cs="Times New Roman"/>
-                <w:i/>
-                <w:iCs/>
-              </w:rPr>
-              <w:t>d</w:t>
-            </w:r>
-            <w:r>
-              <w:rPr>
-                <w:rFonts w:cs="Times New Roman"/>
-              </w:rPr>
-              <w:t>(D−H), Å</w:t>
-            </w:r>
-          </w:p>
-        </w:tc>
-        <w:tc>
-          <w:tcPr>
-            <w:tcW w:w="1701" w:type="dxa"/>
-          </w:tcPr>
-          <w:p>
-            <w:pPr>
-              <w:rPr>
-                <w:rFonts w:cs="Times New Roman"/>
-              </w:rPr>
-            </w:pPr>
-            <w:r>
-              <w:rPr>
-                <w:rFonts w:cs="Times New Roman"/>
-                <w:i/>
-                <w:iCs/>
-              </w:rPr>
-              <w:t>d</w:t>
-            </w:r>
-            <w:r>
-              <w:rPr>
-                <w:rFonts w:cs="Times New Roman"/>
-              </w:rPr>
-              <w:t>(H···A), Å</w:t>
-            </w:r>
-          </w:p>
-        </w:tc>
-        <w:tc>
-          <w:tcPr>
-            <w:tcW w:w="1701" w:type="dxa"/>
-          </w:tcPr>
-          <w:p>
-            <w:pPr>
-              <w:rPr>
-                <w:rFonts w:cs="Times New Roman"/>
-              </w:rPr>
-            </w:pPr>
-            <w:r>
-              <w:rPr>
-                <w:rFonts w:cs="Times New Roman"/>
-                <w:i/>
-                <w:iCs/>
-              </w:rPr>
-              <w:t>d</w:t>
-            </w:r>
-            <w:r>
-              <w:rPr>
-                <w:rFonts w:cs="Times New Roman"/>
-              </w:rPr>
-              <w:t>(D···A), Å</w:t>
-            </w:r>
-          </w:p>
-        </w:tc>
-        <w:tc>
-          <w:tcPr>
-            <w:tcW w:w="1701" w:type="dxa"/>
-          </w:tcPr>
-          <w:p>
-            <w:pPr>
-              <w:rPr>
-                <w:rFonts w:cs="Times New Roman"/>
-              </w:rPr>
-            </w:pPr>
-            <w:r>
-              <w:rPr>
-                <w:rFonts w:cs="Times New Roman"/>
-              </w:rPr>
-              <w:t>α(D−H···A), °</w:t>
-            </w:r>
-          </w:p>
-        </w:tc>
-        <w:tc>
-          <w:tcPr>
-            <w:tcW w:w="1701" w:type="dxa"/>
-          </w:tcPr>
-          <w:p>
-            <w:pPr>
-              <w:rPr>
-                <w:rFonts w:cs="Times New Roman"/>
-              </w:rPr>
-            </w:pPr>
-            <w:r>
-              <w:rPr>
-                <w:rFonts w:cs="Times New Roman"/>
-              </w:rPr>
-              <w:t>Symmetry code</w:t>
-            </w:r>
-          </w:p>
-        </w:tc>
-      </w:tr>
-      <w:tr>
-        <w:tc>
-          <w:tcPr>
-            <w:tcW w:w="1928" w:type="dxa"/>
-            <w:vAlign w:val="center"/>
-          </w:tcPr>
-          <w:p>
-            <w:pPr>
-              <w:rPr>
-                <w:rFonts w:cs="Times New Roman"/>
-              </w:rPr>
-            </w:pPr>
-            <w:r>
-              <w:rPr>
-                <w:rFonts w:cs="Times New Roman"/>
-              </w:rPr>
-              <w:t>{%tr for hb in hbond %}</w:t>
-            </w:r>
-          </w:p>
-        </w:tc>
-        <w:tc>
-          <w:tcPr>
-            <w:tcW w:w="1701" w:type="dxa"/>
-            <w:vAlign w:val="center"/>
-          </w:tcPr>
-          <w:p>
-            <w:pPr>
-              <w:rPr>
-                <w:rFonts w:cs="Times New Roman"/>
-              </w:rPr>
-            </w:pPr>
-            <w:r>
-              <w:rPr>
-                <w:rFonts w:cs="Times New Roman"/>
-              </w:rPr>
-              <w:t>{%tr for hb in hbond %}</w:t>
-            </w:r>
-          </w:p>
-        </w:tc>
-        <w:tc>
-          <w:tcPr>
-            <w:tcW w:w="1701" w:type="dxa"/>
-            <w:vAlign w:val="center"/>
-          </w:tcPr>
-          <w:p>
-            <w:pPr>
-              <w:rPr>
-                <w:rFonts w:cs="Times New Roman"/>
-              </w:rPr>
-            </w:pPr>
-            <w:r>
-              <w:rPr>
-                <w:rFonts w:cs="Times New Roman"/>
-              </w:rPr>
-              <w:t>{%tr for hb in hbond %}</w:t>
-            </w:r>
-          </w:p>
-        </w:tc>
-        <w:tc>
-          <w:tcPr>
-            <w:tcW w:w="1701" w:type="dxa"/>
-            <w:vAlign w:val="center"/>
-          </w:tcPr>
-          <w:p>
-            <w:pPr>
-              <w:rPr>
-                <w:rFonts w:cs="Times New Roman"/>
-              </w:rPr>
-            </w:pPr>
-            <w:r>
-              <w:rPr>
-                <w:rFonts w:cs="Times New Roman"/>
-              </w:rPr>
-              <w:t>{%tr for hb in hbond %}</w:t>
-            </w:r>
-          </w:p>
-        </w:tc>
-        <w:tc>
-          <w:tcPr>
-            <w:tcW w:w="1701" w:type="dxa"/>
-            <w:vAlign w:val="center"/>
-          </w:tcPr>
-          <w:p>
-            <w:pPr>
-              <w:rPr>
-                <w:rFonts w:cs="Times New Roman"/>
-              </w:rPr>
-            </w:pPr>
-            <w:r>
-              <w:rPr>
-                <w:rFonts w:cs="Times New Roman"/>
-              </w:rPr>
-              <w:t>{%tr for hb in hbond %}</w:t>
-            </w:r>
-          </w:p>
-        </w:tc>
-        <w:tc>
-          <w:tcPr>
-            <w:tcW w:w="1701" w:type="dxa"/>
-            <w:vAlign w:val="center"/>
-          </w:tcPr>
-          <w:p>
-            <w:pPr>
-              <w:rPr>
-                <w:rFonts w:cs="Times New Roman"/>
-              </w:rPr>
-            </w:pPr>
-            <w:r>
-              <w:rPr>
-                <w:rFonts w:cs="Times New Roman"/>
-              </w:rPr>
-              <w:t>{%tr for hb in hbond %}</w:t>
-            </w:r>
-          </w:p>
-        </w:tc>
-      </w:tr>
-      <w:tr>
-        <w:tc>
-          <w:tcPr>
-            <w:tcW w:w="1928" w:type="dxa"/>
-            <w:vAlign w:val="center"/>
-          </w:tcPr>
-          <w:p>
-            <w:pPr>
-              <w:rPr>
-                <w:rFonts w:cs="Times New Roman"/>
-              </w:rPr>
-            </w:pPr>
-            <w:r>
-              <w:rPr>
-                <w:rFonts w:cs="Times New Roman"/>
-              </w:rPr>
-              <w:t>{{ hb.donor }}−H···{{ hb.acceptor }}</w:t>
-            </w:r>
-          </w:p>
-        </w:tc>
-        <w:tc>
-          <w:tcPr>
-            <w:tcW w:w="1701" w:type="dxa"/>
-            <w:vAlign w:val="center"/>
-          </w:tcPr>
-          <w:p>
-            <w:pPr>
-              <w:rPr>
-                <w:rFonts w:cs="Times New Roman"/>
-              </w:rPr>
-            </w:pPr>
-            <w:r>
-              <w:rPr>
-                <w:rFonts w:cs="Times New Roman"/>
-              </w:rPr>
-              <w:t>{{ hb.dh_length }}</w:t>
-            </w:r>
-          </w:p>
-        </w:tc>
-        <w:tc>
-          <w:tcPr>
-            <w:tcW w:w="1701" w:type="dxa"/>
-            <w:vAlign w:val="center"/>
-          </w:tcPr>
-          <w:p>
-            <w:pPr>
-              <w:rPr>
-                <w:rFonts w:cs="Times New Roman"/>
-              </w:rPr>
-            </w:pPr>
-            <w:r>
-              <w:rPr>
-                <w:rFonts w:cs="Times New Roman"/>
-              </w:rPr>
-              <w:t>{{ hb.ha_length }}</w:t>
-            </w:r>
-          </w:p>
-        </w:tc>
-        <w:tc>
-          <w:tcPr>
-            <w:tcW w:w="1701" w:type="dxa"/>
-            <w:vAlign w:val="center"/>
-          </w:tcPr>
-          <w:p>
-            <w:pPr>
-              <w:rPr>
-                <w:rFonts w:cs="Times New Roman"/>
-              </w:rPr>
-            </w:pPr>
-            <w:r>
-              <w:rPr>
-                <w:rFonts w:cs="Times New Roman"/>
-              </w:rPr>
-              <w:t>{{ hb.da_length }}</w:t>
-            </w:r>
-          </w:p>
-        </w:tc>
-        <w:tc>
-          <w:tcPr>
-            <w:tcW w:w="1701" w:type="dxa"/>
-            <w:vAlign w:val="center"/>
-          </w:tcPr>
-          <w:p>
-            <w:pPr>
-              <w:rPr>
-                <w:rFonts w:cs="Times New Roman"/>
-              </w:rPr>
-            </w:pPr>
-            <w:r>
-              <w:rPr>
-                <w:rFonts w:cs="Times New Roman"/>
-              </w:rPr>
-              <w:t>{{ hb.dha_angle }}</w:t>
-            </w:r>
-          </w:p>
-        </w:tc>
-        <w:tc>
-          <w:tcPr>
-            <w:tcW w:w="1701" w:type="dxa"/>
-            <w:vAlign w:val="center"/>
-          </w:tcPr>
-          <w:p>
-            <w:pPr>
-              <w:rPr>
-                <w:rFonts w:cs="Times New Roman"/>
-              </w:rPr>
-            </w:pPr>
-            <w:r>
-              <w:rPr>
-                <w:rFonts w:cs="Times New Roman"/>
-              </w:rPr>
-              <w:t>{{r hb.symmop }}</w:t>
-            </w:r>
-          </w:p>
-        </w:tc>
-      </w:tr>
-      <w:tr>
-        <w:tc>
-          <w:tcPr>
-            <w:tcW w:w="1928" w:type="dxa"/>
-            <w:vAlign w:val="center"/>
-          </w:tcPr>
-          <w:p>
-            <w:pPr>
-              <w:rPr>
-                <w:rFonts w:cs="Times New Roman"/>
-              </w:rPr>
-            </w:pPr>
-            <w:r>
-              <w:rPr>
-                <w:rFonts w:cs="Times New Roman"/>
-              </w:rPr>
-              <w:t>{%tr endfor %}</w:t>
-            </w:r>
-          </w:p>
-        </w:tc>
-        <w:tc>
-          <w:tcPr>
-            <w:tcW w:w="1701" w:type="dxa"/>
-            <w:vAlign w:val="center"/>
-          </w:tcPr>
-          <w:p>
-            <w:pPr>
-              <w:rPr>
-                <w:rFonts w:cs="Times New Roman"/>
-              </w:rPr>
-            </w:pPr>
-            <w:r>
-              <w:rPr>
-                <w:rFonts w:cs="Times New Roman"/>
-              </w:rPr>
-              <w:t>{%tr endfor %}</w:t>
-            </w:r>
-          </w:p>
-        </w:tc>
-        <w:tc>
-          <w:tcPr>
-            <w:tcW w:w="1701" w:type="dxa"/>
-            <w:vAlign w:val="center"/>
-          </w:tcPr>
-          <w:p>
-            <w:pPr>
-              <w:rPr>
-                <w:rFonts w:cs="Times New Roman"/>
-              </w:rPr>
-            </w:pPr>
-            <w:r>
-              <w:rPr>
-                <w:rFonts w:cs="Times New Roman"/>
-              </w:rPr>
-              <w:t>{%tr endfor %}</w:t>
-            </w:r>
-          </w:p>
-        </w:tc>
-        <w:tc>
-          <w:tcPr>
-            <w:tcW w:w="1701" w:type="dxa"/>
-            <w:vAlign w:val="center"/>
-          </w:tcPr>
-          <w:p>
-            <w:pPr>
-              <w:rPr>
-                <w:rFonts w:cs="Times New Roman"/>
-              </w:rPr>
-            </w:pPr>
-            <w:r>
-              <w:rPr>
-                <w:rFonts w:cs="Times New Roman"/>
-              </w:rPr>
-              <w:t>{%tr endfor %}</w:t>
-            </w:r>
-          </w:p>
-        </w:tc>
-        <w:tc>
-          <w:tcPr>
-            <w:tcW w:w="1701" w:type="dxa"/>
-            <w:vAlign w:val="center"/>
-          </w:tcPr>
-          <w:p>
-            <w:pPr>
-              <w:rPr>
-                <w:rFonts w:cs="Times New Roman"/>
-              </w:rPr>
-            </w:pPr>
-            <w:r>
-              <w:rPr>
-                <w:rFonts w:cs="Times New Roman"/>
-              </w:rPr>
-              <w:t>{%tr endfor %}</w:t>
-            </w:r>
-          </w:p>
-        </w:tc>
-        <w:tc>
-          <w:tcPr>
-            <w:tcW w:w="1701" w:type="dxa"/>
-            <w:vAlign w:val="center"/>
-          </w:tcPr>
-          <w:p>
-            <w:pPr>
-              <w:rPr>
-                <w:rFonts w:cs="Times New Roman"/>
-              </w:rPr>
-            </w:pPr>
-            <w:r>
-              <w:rPr>
-                <w:rFonts w:cs="Times New Roman"/>
-              </w:rPr>
-              <w:t>{%tr endfor %}</w:t>
             </w:r>
           </w:p>
         </w:tc>
@@ -2776,7 +2498,7 @@
     <w:lsdException w:name="Table Web 2" w:semiHidden="1" w:unhideWhenUsed="1"/>
     <w:lsdException w:name="Table Web 3" w:semiHidden="1" w:unhideWhenUsed="1"/>
     <w:lsdException w:name="Balloon Text" w:semiHidden="1" w:unhideWhenUsed="1"/>
-    <w:lsdException w:name="Table Grid" w:uiPriority="39"/>
+    <w:lsdException w:name="Table Grid" w:uiPriority="59"/>
     <w:lsdException w:name="Table Theme" w:semiHidden="1" w:unhideWhenUsed="1"/>
     <w:lsdException w:name="Placeholder Text" w:semiHidden="1"/>
     <w:lsdException w:name="No Spacing" w:uiPriority="1" w:qFormat="1"/>
@@ -3936,7 +3658,7 @@
   <w:style w:type="table" w:styleId="aff0">
     <w:name w:val="Table Grid"/>
     <w:basedOn w:val="a3"/>
-    <w:uiPriority w:val="39"/>
+    <w:uiPriority w:val="59"/>
     <w:rsid w:val="00FC693F"/>
     <w:pPr>
       <w:spacing w:after="0" w:line="240" w:lineRule="auto"/>

</xml_diff>